<commit_message>
feat: add selected architecture work and AI pathways
</commit_message>
<xml_diff>
--- a/public/documents/Angel_Godd_Santana_Principal_Cloud_AI_Architect_Resume.docx
+++ b/public/documents/Angel_Godd_Santana_Principal_Cloud_AI_Architect_Resume.docx
@@ -44,7 +44,7 @@
           <w:color w:val="000000"/>
           <w:sz w:val="18"/>
         </w:rPr>
-        <w:t>Miami-Fort Lauderdale, FL | U.S. Remote | goddsantana@gmail.com | linkedin.com/in/angelgoddsantana | angelgoddsantana.me</w:t>
+        <w:t>Homestead, FL, USA | Remote only | goddsantana@gmail.com | linkedin.com/in/angelgoddsantana | angelgoddsantana.me</w:t>
       </w:r>
     </w:p>
     <w:p>
@@ -74,7 +74,7 @@
           <w:color w:val="000000"/>
           <w:sz w:val="20"/>
         </w:rPr>
-        <w:t>Principal-level cloud architect with 20+ years in IT and infrastructure, including 10+ years designing and operating Azure environments. Brings enterprise depth across Azure, Azure Government, AWS, GCP, identity architecture, cloud governance, FedRAMP-aware delivery, and AI platform enablement. Known for translating complex security, compliance, and modernization requirements into operational architectures, repeatable governance patterns, and delivery standards.</w:t>
+        <w:t>Principal Cloud &amp; AI Platform Architect with 20+ years in IT and infrastructure and 10+ years designing and operating Azure environments. Designs secure, governable cloud platforms across Azure, Azure Government, AWS, GCP, hybrid infrastructure, identity, cloud governance, and modernization delivery. Brings enterprise architecture leadership together with AI-enabled solution design, proof-of-concept development, and disciplined human review and validation.</w:t>
       </w:r>
     </w:p>
     <w:p>
@@ -166,14 +166,14 @@
           <w:b/>
           <w:sz w:val="20"/>
         </w:rPr>
-        <w:t xml:space="preserve">AI Enablement: </w:t>
+        <w:t xml:space="preserve">AI-Enabled Solution Delivery: </w:t>
       </w:r>
       <w:r>
         <w:rPr>
           <w:rFonts w:ascii="Arial" w:hAnsi="Arial"/>
           <w:sz w:val="20"/>
         </w:rPr>
-        <w:t>Azure AI Foundry, OpenAI APIs, Gemini, AI-enabled workflow automation, RAG and agent concepts</w:t>
+        <w:t>AI-assisted research, solution design, technical documentation, code review, workflow automation, and proof-of-concept development; human-in-the-loop security and quality validation</w:t>
       </w:r>
     </w:p>
     <w:p>
@@ -290,7 +290,7 @@
           <w:rFonts w:ascii="Arial" w:hAnsi="Arial"/>
           <w:sz w:val="20"/>
         </w:rPr>
-        <w:t>Supported enterprise Azure governance across commercial and government-facing client environments.</w:t>
+        <w:t>Supported cloud-governance operating standards across commercial and government-facing cloud environments.</w:t>
       </w:r>
     </w:p>
     <w:p>
@@ -305,7 +305,7 @@
           <w:rFonts w:ascii="Arial" w:hAnsi="Arial"/>
           <w:sz w:val="20"/>
         </w:rPr>
-        <w:t>Mentored engineers in cloud operations, governance, and AI-enabled workflow adoption.</w:t>
+        <w:t>Mentored engineers in cloud operations and governance.</w:t>
       </w:r>
     </w:p>
     <w:p>
@@ -341,7 +341,7 @@
           <w:rFonts w:ascii="Arial" w:hAnsi="Arial"/>
           <w:sz w:val="20"/>
         </w:rPr>
-        <w:t>Re-established a previously dormant LLC as an independent cloud and AI platform architecture practice in September 2025, after completing a full-time enterprise role.</w:t>
+        <w:t>Re-established a dormant LLC after completing a full-time enterprise role; developing security-conscious cloud and AI platform architecture offerings for U.S.-remote engagements.</w:t>
       </w:r>
     </w:p>
     <w:p>
@@ -356,7 +356,7 @@
           <w:rFonts w:ascii="Arial" w:hAnsi="Arial"/>
           <w:sz w:val="20"/>
         </w:rPr>
-        <w:t>Building service offerings, reference architectures, and delivery standards across Azure, GCP, identity, cloud governance, and AI-enabled workflow automation.</w:t>
+        <w:t>Build and validate redacted reference architectures, proofs of concept, and delivery standards across Azure, GCP, identity, cloud governance, and AI-enabled workflow automation.</w:t>
       </w:r>
     </w:p>
     <w:p>
@@ -371,7 +371,7 @@
           <w:rFonts w:ascii="Arial" w:hAnsi="Arial"/>
           <w:sz w:val="20"/>
         </w:rPr>
-        <w:t>Available for selected U.S.-remote cloud and AI architecture advisory or project engagements.</w:t>
+        <w:t>Apply AI-assisted workflow techniques to accelerate research, solution design, documentation, prototype development, and delivery preparation; use human architecture, security, and quality gates before use.</w:t>
       </w:r>
     </w:p>
     <w:p>
@@ -412,7 +412,7 @@
           <w:rFonts w:ascii="Arial" w:hAnsi="Arial"/>
           <w:sz w:val="20"/>
         </w:rPr>
-        <w:t xml:space="preserve"> | Vertice Technologies | Miami, FL | Oct 2017 - Feb 2018</w:t>
+        <w:t xml:space="preserve"> | Vertice Technologies | Oct 2017 - Feb 2018</w:t>
       </w:r>
     </w:p>
     <w:p>
@@ -604,7 +604,7 @@
           <w:color w:val="1B3F6F"/>
           <w:sz w:val="21"/>
         </w:rPr>
-        <w:t>SELECTED LEADERSHIP HIGHLIGHTS</w:t>
+        <w:t>SELECTED ARCHITECTURE WORK</w:t>
       </w:r>
     </w:p>
     <w:p>
@@ -619,7 +619,7 @@
           <w:rFonts w:ascii="Arial" w:hAnsi="Arial"/>
           <w:sz w:val="20"/>
         </w:rPr>
-        <w:t>Azure Government, identity, and cloud-governance experience across regulated and enterprise environments.</w:t>
+        <w:t>Azure Lighthouse Governance Reference — Private reference implementation; redacted architecture brief available on request.</w:t>
       </w:r>
     </w:p>
     <w:p>
@@ -634,7 +634,7 @@
           <w:rFonts w:ascii="Arial" w:hAnsi="Arial"/>
           <w:sz w:val="20"/>
         </w:rPr>
-        <w:t>Cross-cloud architecture experience spanning Azure, AWS, GCP, hybrid infrastructure, and secure identity federation.</w:t>
+        <w:t>Cross-Cloud Identity Architecture — Azure Government and AWS Gov SAML federation, identity boundaries, role design, and governance.</w:t>
       </w:r>
     </w:p>
     <w:p>
@@ -649,7 +649,7 @@
           <w:rFonts w:ascii="Arial" w:hAnsi="Arial"/>
           <w:sz w:val="20"/>
         </w:rPr>
-        <w:t>Technical mentorship and architecture leadership for cloud operations and modernization initiatives.</w:t>
+        <w:t>Secure AI Platform Reference — Independent reference and proof of concept in development; identity, secrets, observability, review gates, and deployment boundaries.</w:t>
       </w:r>
     </w:p>
     <w:sectPr>

</xml_diff>